<commit_message>
CV: add LinkedIn, homepage and GitHub links to the Word CV headers
The Typst CV already carried Scholar / Website / GitHub / LinkedIn; the Word
editions only had the homepage (and Scholar, in English). Both now render the
same set from profile.links, grouped so each line fits the header column.

Co-Authored-By: Claude Opus 5 (1M context) <noreply@anthropic.com>
Claude-Session: https://claude.ai/code/session_01VmoH6vL1zoej23r8gn9Tdd
</commit_message>
<xml_diff>
--- a/CV/Curriculum Vitae Chihun Lee (2026.09).docx
+++ b/CV/Curriculum Vitae Chihun Lee (2026.09).docx
@@ -111,7 +111,23 @@
                 <w:color w:val="333333"/>
                 <w:sz w:val="18"/>
               </w:rPr>
-              <w:t>Web: https://chihun-lee.github.io</w:t>
+              <w:t>Homepage: https://chihun-lee.github.io   ·   GitHub: https://github.com/Chihun-Lee</w:t>
+            </w:r>
+          </w:p>
+          <w:p>
+            <w:pPr>
+              <w:spacing w:before="0" w:after="0" w:line="250" w:lineRule="auto"/>
+              <w:jc w:val="left"/>
+            </w:pPr>
+            <w:r>
+              <w:rPr>
+                <w:rFonts w:eastAsia="맑은 고딕"/>
+                <w:b w:val="0"/>
+                <w:i w:val="0"/>
+                <w:color w:val="333333"/>
+                <w:sz w:val="18"/>
+              </w:rPr>
+              <w:t>LinkedIn: https://www.linkedin.com/in/chihun-lee-078082412/</w:t>
             </w:r>
           </w:p>
           <w:p>

</xml_diff>

<commit_message>
CV: Korean edition keeps publications and conferences (English citations)
The Korean 이력서 now carries the same publication, conference and Scholar
sections as the English CV, under Korean headings — the titles and venues are
English to begin with, so only the headings are localized.

Layout, to keep both editions at four pages with no orphan section:
- ■ heading marker pinned to the East Asian font, so it renders as the same
  square before Latin and Hangul titles alike
- keep-with-next on headings; tighter list spacing and 40 pt page margins

Co-Authored-By: Claude Opus 5 (1M context) <noreply@anthropic.com>
Claude-Session: https://claude.ai/code/session_01VmoH6vL1zoej23r8gn9Tdd
</commit_message>
<xml_diff>
--- a/CV/Curriculum Vitae Chihun Lee (2026.09).docx
+++ b/CV/Curriculum Vitae Chihun Lee (2026.09).docx
@@ -21,7 +21,7 @@
           </w:tcPr>
           <w:p>
             <w:pPr>
-              <w:spacing w:before="0" w:after="60" w:line="250" w:lineRule="auto"/>
+              <w:spacing w:before="0" w:after="60" w:line="245" w:lineRule="auto"/>
               <w:jc w:val="left"/>
             </w:pPr>
             <w:r>
@@ -36,7 +36,7 @@
           </w:p>
           <w:p>
             <w:pPr>
-              <w:spacing w:before="0" w:after="0" w:line="250" w:lineRule="auto"/>
+              <w:spacing w:before="0" w:after="0" w:line="245" w:lineRule="auto"/>
               <w:jc w:val="left"/>
             </w:pPr>
             <w:r>
@@ -52,7 +52,7 @@
           </w:p>
           <w:p>
             <w:pPr>
-              <w:spacing w:before="0" w:after="0" w:line="250" w:lineRule="auto"/>
+              <w:spacing w:before="0" w:after="0" w:line="245" w:lineRule="auto"/>
               <w:jc w:val="left"/>
             </w:pPr>
             <w:r>
@@ -68,7 +68,7 @@
           </w:p>
           <w:p>
             <w:pPr>
-              <w:spacing w:before="0" w:after="0" w:line="250" w:lineRule="auto"/>
+              <w:spacing w:before="0" w:after="0" w:line="245" w:lineRule="auto"/>
               <w:jc w:val="left"/>
             </w:pPr>
             <w:r>
@@ -84,7 +84,7 @@
           </w:p>
           <w:p>
             <w:pPr>
-              <w:spacing w:before="0" w:after="0" w:line="250" w:lineRule="auto"/>
+              <w:spacing w:before="0" w:after="0" w:line="245" w:lineRule="auto"/>
               <w:jc w:val="left"/>
             </w:pPr>
             <w:r>
@@ -100,7 +100,7 @@
           </w:p>
           <w:p>
             <w:pPr>
-              <w:spacing w:before="0" w:after="0" w:line="250" w:lineRule="auto"/>
+              <w:spacing w:before="0" w:after="0" w:line="245" w:lineRule="auto"/>
               <w:jc w:val="left"/>
             </w:pPr>
             <w:r>
@@ -116,7 +116,7 @@
           </w:p>
           <w:p>
             <w:pPr>
-              <w:spacing w:before="0" w:after="0" w:line="250" w:lineRule="auto"/>
+              <w:spacing w:before="0" w:after="0" w:line="245" w:lineRule="auto"/>
               <w:jc w:val="left"/>
             </w:pPr>
             <w:r>
@@ -132,7 +132,7 @@
           </w:p>
           <w:p>
             <w:pPr>
-              <w:spacing w:before="0" w:after="0" w:line="250" w:lineRule="auto"/>
+              <w:spacing w:before="0" w:after="0" w:line="245" w:lineRule="auto"/>
               <w:jc w:val="left"/>
             </w:pPr>
             <w:r>
@@ -196,23 +196,33 @@
     </w:tbl>
     <w:p>
       <w:pPr>
-        <w:spacing w:before="0" w:after="0" w:line="250" w:lineRule="auto"/>
+        <w:spacing w:before="0" w:after="0" w:line="245" w:lineRule="auto"/>
         <w:jc w:val="left"/>
       </w:pPr>
     </w:p>
     <w:p>
       <w:pPr>
-        <w:spacing w:before="180" w:after="60" w:line="250" w:lineRule="auto"/>
+        <w:keepNext/>
+        <w:spacing w:before="120" w:after="60" w:line="245" w:lineRule="auto"/>
         <w:jc w:val="left"/>
       </w:pPr>
       <w:r>
         <w:rPr>
-          <w:rFonts w:eastAsia="맑은 고딕"/>
+          <w:rFonts w:eastAsia="맑은 고딕" w:hint="eastAsia"/>
           <w:b/>
           <w:i w:val="0"/>
           <w:sz w:val="22"/>
         </w:rPr>
-        <w:t>■ Education</w:t>
+        <w:t xml:space="preserve">■ </w:t>
+      </w:r>
+      <w:r>
+        <w:rPr>
+          <w:rFonts w:eastAsia="맑은 고딕"/>
+          <w:b/>
+          <w:i w:val="0"/>
+          <w:sz w:val="22"/>
+        </w:rPr>
+        <w:t>Education</w:t>
       </w:r>
     </w:p>
     <w:p>
@@ -220,7 +230,7 @@
         <w:tabs>
           <w:tab w:pos="2240" w:val="left"/>
         </w:tabs>
-        <w:spacing w:before="0" w:after="40" w:line="250" w:lineRule="auto"/>
+        <w:spacing w:before="0" w:after="30" w:line="245" w:lineRule="auto"/>
         <w:ind w:left="2240" w:hanging="2240"/>
         <w:jc w:val="left"/>
       </w:pPr>
@@ -249,7 +259,7 @@
         <w:tabs>
           <w:tab w:pos="2240" w:val="left"/>
         </w:tabs>
-        <w:spacing w:before="0" w:after="40" w:line="250" w:lineRule="auto"/>
+        <w:spacing w:before="0" w:after="30" w:line="245" w:lineRule="auto"/>
         <w:ind w:left="2240" w:hanging="2240"/>
         <w:jc w:val="left"/>
       </w:pPr>
@@ -278,7 +288,7 @@
         <w:tabs>
           <w:tab w:pos="2240" w:val="left"/>
         </w:tabs>
-        <w:spacing w:before="0" w:after="40" w:line="250" w:lineRule="auto"/>
+        <w:spacing w:before="0" w:after="30" w:line="245" w:lineRule="auto"/>
         <w:ind w:left="2240" w:hanging="2240"/>
         <w:jc w:val="left"/>
       </w:pPr>
@@ -304,17 +314,27 @@
     </w:p>
     <w:p>
       <w:pPr>
-        <w:spacing w:before="180" w:after="60" w:line="250" w:lineRule="auto"/>
+        <w:keepNext/>
+        <w:spacing w:before="120" w:after="60" w:line="245" w:lineRule="auto"/>
         <w:jc w:val="left"/>
       </w:pPr>
       <w:r>
         <w:rPr>
-          <w:rFonts w:eastAsia="맑은 고딕"/>
+          <w:rFonts w:eastAsia="맑은 고딕" w:hint="eastAsia"/>
           <w:b/>
           <w:i w:val="0"/>
           <w:sz w:val="22"/>
         </w:rPr>
-        <w:t>■ Experience</w:t>
+        <w:t xml:space="preserve">■ </w:t>
+      </w:r>
+      <w:r>
+        <w:rPr>
+          <w:rFonts w:eastAsia="맑은 고딕"/>
+          <w:b/>
+          <w:i w:val="0"/>
+          <w:sz w:val="22"/>
+        </w:rPr>
+        <w:t>Experience</w:t>
       </w:r>
     </w:p>
     <w:p>
@@ -322,7 +342,7 @@
         <w:tabs>
           <w:tab w:pos="2240" w:val="left"/>
         </w:tabs>
-        <w:spacing w:before="0" w:after="40" w:line="250" w:lineRule="auto"/>
+        <w:spacing w:before="0" w:after="30" w:line="245" w:lineRule="auto"/>
         <w:ind w:left="2240" w:hanging="2240"/>
         <w:jc w:val="left"/>
       </w:pPr>
@@ -351,7 +371,7 @@
         <w:tabs>
           <w:tab w:pos="2240" w:val="left"/>
         </w:tabs>
-        <w:spacing w:before="0" w:after="40" w:line="250" w:lineRule="auto"/>
+        <w:spacing w:before="0" w:after="30" w:line="245" w:lineRule="auto"/>
         <w:ind w:left="2240" w:hanging="2240"/>
         <w:jc w:val="left"/>
       </w:pPr>
@@ -380,7 +400,7 @@
         <w:tabs>
           <w:tab w:pos="2240" w:val="left"/>
         </w:tabs>
-        <w:spacing w:before="0" w:after="40" w:line="250" w:lineRule="auto"/>
+        <w:spacing w:before="0" w:after="30" w:line="245" w:lineRule="auto"/>
         <w:ind w:left="2240" w:hanging="2240"/>
         <w:jc w:val="left"/>
       </w:pPr>
@@ -409,7 +429,7 @@
         <w:tabs>
           <w:tab w:pos="2240" w:val="left"/>
         </w:tabs>
-        <w:spacing w:before="0" w:after="40" w:line="250" w:lineRule="auto"/>
+        <w:spacing w:before="0" w:after="30" w:line="245" w:lineRule="auto"/>
         <w:ind w:left="2240" w:hanging="2240"/>
         <w:jc w:val="left"/>
       </w:pPr>
@@ -435,22 +455,32 @@
     </w:p>
     <w:p>
       <w:pPr>
-        <w:spacing w:before="180" w:after="60" w:line="250" w:lineRule="auto"/>
+        <w:keepNext/>
+        <w:spacing w:before="120" w:after="60" w:line="245" w:lineRule="auto"/>
         <w:jc w:val="left"/>
       </w:pPr>
       <w:r>
         <w:rPr>
-          <w:rFonts w:eastAsia="맑은 고딕"/>
+          <w:rFonts w:eastAsia="맑은 고딕" w:hint="eastAsia"/>
           <w:b/>
           <w:i w:val="0"/>
           <w:sz w:val="22"/>
         </w:rPr>
-        <w:t>■ First Author Peer-Reviewed Publications (+: equal contributions, *: corresponding author)</w:t>
+        <w:t xml:space="preserve">■ </w:t>
+      </w:r>
+      <w:r>
+        <w:rPr>
+          <w:rFonts w:eastAsia="맑은 고딕"/>
+          <w:b/>
+          <w:i w:val="0"/>
+          <w:sz w:val="22"/>
+        </w:rPr>
+        <w:t>First Author Peer-Reviewed Publications (+: equal contributions, *: corresponding author)</w:t>
       </w:r>
     </w:p>
     <w:p>
       <w:pPr>
-        <w:spacing w:before="0" w:after="40" w:line="250" w:lineRule="auto"/>
+        <w:spacing w:before="0" w:after="24" w:line="245" w:lineRule="auto"/>
         <w:ind w:left="360" w:hanging="360"/>
         <w:jc w:val="left"/>
       </w:pPr>
@@ -493,7 +523,7 @@
     </w:p>
     <w:p>
       <w:pPr>
-        <w:spacing w:before="0" w:after="40" w:line="250" w:lineRule="auto"/>
+        <w:spacing w:before="0" w:after="24" w:line="245" w:lineRule="auto"/>
         <w:ind w:left="360" w:hanging="360"/>
         <w:jc w:val="left"/>
       </w:pPr>
@@ -545,7 +575,7 @@
     </w:p>
     <w:p>
       <w:pPr>
-        <w:spacing w:before="0" w:after="40" w:line="250" w:lineRule="auto"/>
+        <w:spacing w:before="0" w:after="24" w:line="245" w:lineRule="auto"/>
         <w:ind w:left="360" w:hanging="360"/>
         <w:jc w:val="left"/>
       </w:pPr>
@@ -597,7 +627,7 @@
     </w:p>
     <w:p>
       <w:pPr>
-        <w:spacing w:before="0" w:after="40" w:line="250" w:lineRule="auto"/>
+        <w:spacing w:before="0" w:after="24" w:line="245" w:lineRule="auto"/>
         <w:ind w:left="360" w:hanging="360"/>
         <w:jc w:val="left"/>
       </w:pPr>
@@ -649,7 +679,7 @@
     </w:p>
     <w:p>
       <w:pPr>
-        <w:spacing w:before="0" w:after="40" w:line="250" w:lineRule="auto"/>
+        <w:spacing w:before="0" w:after="24" w:line="245" w:lineRule="auto"/>
         <w:ind w:left="360" w:hanging="360"/>
         <w:jc w:val="left"/>
       </w:pPr>
@@ -701,7 +731,7 @@
     </w:p>
     <w:p>
       <w:pPr>
-        <w:spacing w:before="0" w:after="40" w:line="250" w:lineRule="auto"/>
+        <w:spacing w:before="0" w:after="24" w:line="245" w:lineRule="auto"/>
         <w:ind w:left="360" w:hanging="360"/>
         <w:jc w:val="left"/>
       </w:pPr>
@@ -753,7 +783,7 @@
     </w:p>
     <w:p>
       <w:pPr>
-        <w:spacing w:before="0" w:after="40" w:line="250" w:lineRule="auto"/>
+        <w:spacing w:before="0" w:after="24" w:line="245" w:lineRule="auto"/>
         <w:ind w:left="360" w:hanging="360"/>
         <w:jc w:val="left"/>
       </w:pPr>
@@ -805,7 +835,7 @@
     </w:p>
     <w:p>
       <w:pPr>
-        <w:spacing w:before="0" w:after="40" w:line="250" w:lineRule="auto"/>
+        <w:spacing w:before="0" w:after="24" w:line="245" w:lineRule="auto"/>
         <w:ind w:left="360" w:hanging="360"/>
         <w:jc w:val="left"/>
       </w:pPr>
@@ -857,7 +887,7 @@
     </w:p>
     <w:p>
       <w:pPr>
-        <w:spacing w:before="0" w:after="40" w:line="250" w:lineRule="auto"/>
+        <w:spacing w:before="0" w:after="24" w:line="245" w:lineRule="auto"/>
         <w:ind w:left="360" w:hanging="360"/>
         <w:jc w:val="left"/>
       </w:pPr>
@@ -909,7 +939,7 @@
     </w:p>
     <w:p>
       <w:pPr>
-        <w:spacing w:before="0" w:after="40" w:line="250" w:lineRule="auto"/>
+        <w:spacing w:before="0" w:after="24" w:line="245" w:lineRule="auto"/>
         <w:ind w:left="360" w:hanging="360"/>
         <w:jc w:val="left"/>
       </w:pPr>
@@ -961,7 +991,7 @@
     </w:p>
     <w:p>
       <w:pPr>
-        <w:spacing w:before="0" w:after="40" w:line="250" w:lineRule="auto"/>
+        <w:spacing w:before="0" w:after="24" w:line="245" w:lineRule="auto"/>
         <w:ind w:left="360" w:hanging="360"/>
         <w:jc w:val="left"/>
       </w:pPr>
@@ -1013,22 +1043,32 @@
     </w:p>
     <w:p>
       <w:pPr>
-        <w:spacing w:before="180" w:after="60" w:line="250" w:lineRule="auto"/>
+        <w:keepNext/>
+        <w:spacing w:before="120" w:after="60" w:line="245" w:lineRule="auto"/>
         <w:jc w:val="left"/>
       </w:pPr>
       <w:r>
         <w:rPr>
-          <w:rFonts w:eastAsia="맑은 고딕"/>
+          <w:rFonts w:eastAsia="맑은 고딕" w:hint="eastAsia"/>
           <w:b/>
           <w:i w:val="0"/>
           <w:sz w:val="22"/>
         </w:rPr>
-        <w:t>■ Co-Author Peer-Reviewed Publications</w:t>
+        <w:t xml:space="preserve">■ </w:t>
+      </w:r>
+      <w:r>
+        <w:rPr>
+          <w:rFonts w:eastAsia="맑은 고딕"/>
+          <w:b/>
+          <w:i w:val="0"/>
+          <w:sz w:val="22"/>
+        </w:rPr>
+        <w:t>Co-Author Peer-Reviewed Publications</w:t>
       </w:r>
     </w:p>
     <w:p>
       <w:pPr>
-        <w:spacing w:before="0" w:after="40" w:line="250" w:lineRule="auto"/>
+        <w:spacing w:before="0" w:after="24" w:line="245" w:lineRule="auto"/>
         <w:ind w:left="360" w:hanging="360"/>
         <w:jc w:val="left"/>
       </w:pPr>
@@ -1080,7 +1120,7 @@
     </w:p>
     <w:p>
       <w:pPr>
-        <w:spacing w:before="0" w:after="40" w:line="250" w:lineRule="auto"/>
+        <w:spacing w:before="0" w:after="24" w:line="245" w:lineRule="auto"/>
         <w:ind w:left="360" w:hanging="360"/>
         <w:jc w:val="left"/>
       </w:pPr>
@@ -1123,7 +1163,7 @@
     </w:p>
     <w:p>
       <w:pPr>
-        <w:spacing w:before="0" w:after="40" w:line="250" w:lineRule="auto"/>
+        <w:spacing w:before="0" w:after="24" w:line="245" w:lineRule="auto"/>
         <w:ind w:left="360" w:hanging="360"/>
         <w:jc w:val="left"/>
       </w:pPr>
@@ -1175,7 +1215,7 @@
     </w:p>
     <w:p>
       <w:pPr>
-        <w:spacing w:before="0" w:after="40" w:line="250" w:lineRule="auto"/>
+        <w:spacing w:before="0" w:after="24" w:line="245" w:lineRule="auto"/>
         <w:ind w:left="360" w:hanging="360"/>
         <w:jc w:val="left"/>
       </w:pPr>
@@ -1227,7 +1267,7 @@
     </w:p>
     <w:p>
       <w:pPr>
-        <w:spacing w:before="0" w:after="40" w:line="250" w:lineRule="auto"/>
+        <w:spacing w:before="0" w:after="24" w:line="245" w:lineRule="auto"/>
         <w:ind w:left="360" w:hanging="360"/>
         <w:jc w:val="left"/>
       </w:pPr>
@@ -1279,7 +1319,7 @@
     </w:p>
     <w:p>
       <w:pPr>
-        <w:spacing w:before="0" w:after="40" w:line="250" w:lineRule="auto"/>
+        <w:spacing w:before="0" w:after="24" w:line="245" w:lineRule="auto"/>
         <w:ind w:left="360" w:hanging="360"/>
         <w:jc w:val="left"/>
       </w:pPr>
@@ -1331,7 +1371,7 @@
     </w:p>
     <w:p>
       <w:pPr>
-        <w:spacing w:before="0" w:after="40" w:line="250" w:lineRule="auto"/>
+        <w:spacing w:before="0" w:after="24" w:line="245" w:lineRule="auto"/>
         <w:ind w:left="360" w:hanging="360"/>
         <w:jc w:val="left"/>
       </w:pPr>
@@ -1374,7 +1414,7 @@
     </w:p>
     <w:p>
       <w:pPr>
-        <w:spacing w:before="0" w:after="40" w:line="250" w:lineRule="auto"/>
+        <w:spacing w:before="0" w:after="24" w:line="245" w:lineRule="auto"/>
         <w:ind w:left="360" w:hanging="360"/>
         <w:jc w:val="left"/>
       </w:pPr>
@@ -1417,7 +1457,7 @@
     </w:p>
     <w:p>
       <w:pPr>
-        <w:spacing w:before="0" w:after="40" w:line="250" w:lineRule="auto"/>
+        <w:spacing w:before="0" w:after="24" w:line="245" w:lineRule="auto"/>
         <w:ind w:left="360" w:hanging="360"/>
         <w:jc w:val="left"/>
       </w:pPr>
@@ -1469,7 +1509,7 @@
     </w:p>
     <w:p>
       <w:pPr>
-        <w:spacing w:before="0" w:after="40" w:line="250" w:lineRule="auto"/>
+        <w:spacing w:before="0" w:after="24" w:line="245" w:lineRule="auto"/>
         <w:ind w:left="360" w:hanging="360"/>
         <w:jc w:val="left"/>
       </w:pPr>
@@ -1521,7 +1561,7 @@
     </w:p>
     <w:p>
       <w:pPr>
-        <w:spacing w:before="0" w:after="40" w:line="250" w:lineRule="auto"/>
+        <w:spacing w:before="0" w:after="24" w:line="245" w:lineRule="auto"/>
         <w:ind w:left="360" w:hanging="360"/>
         <w:jc w:val="left"/>
       </w:pPr>
@@ -1564,7 +1604,7 @@
     </w:p>
     <w:p>
       <w:pPr>
-        <w:spacing w:before="0" w:after="40" w:line="250" w:lineRule="auto"/>
+        <w:spacing w:before="0" w:after="24" w:line="245" w:lineRule="auto"/>
         <w:ind w:left="360" w:hanging="360"/>
         <w:jc w:val="left"/>
       </w:pPr>
@@ -1616,7 +1656,7 @@
     </w:p>
     <w:p>
       <w:pPr>
-        <w:spacing w:before="0" w:after="40" w:line="250" w:lineRule="auto"/>
+        <w:spacing w:before="0" w:after="24" w:line="245" w:lineRule="auto"/>
         <w:ind w:left="360" w:hanging="360"/>
         <w:jc w:val="left"/>
       </w:pPr>
@@ -1668,7 +1708,7 @@
     </w:p>
     <w:p>
       <w:pPr>
-        <w:spacing w:before="0" w:after="40" w:line="250" w:lineRule="auto"/>
+        <w:spacing w:before="0" w:after="24" w:line="245" w:lineRule="auto"/>
         <w:ind w:left="360" w:hanging="360"/>
         <w:jc w:val="left"/>
       </w:pPr>
@@ -1720,17 +1760,27 @@
     </w:p>
     <w:p>
       <w:pPr>
-        <w:spacing w:before="180" w:after="60" w:line="250" w:lineRule="auto"/>
+        <w:keepNext/>
+        <w:spacing w:before="120" w:after="60" w:line="245" w:lineRule="auto"/>
         <w:jc w:val="left"/>
       </w:pPr>
       <w:r>
         <w:rPr>
-          <w:rFonts w:eastAsia="맑은 고딕"/>
+          <w:rFonts w:eastAsia="맑은 고딕" w:hint="eastAsia"/>
           <w:b/>
           <w:i w:val="0"/>
           <w:sz w:val="22"/>
         </w:rPr>
-        <w:t>■ Research Projects</w:t>
+        <w:t xml:space="preserve">■ </w:t>
+      </w:r>
+      <w:r>
+        <w:rPr>
+          <w:rFonts w:eastAsia="맑은 고딕"/>
+          <w:b/>
+          <w:i w:val="0"/>
+          <w:sz w:val="22"/>
+        </w:rPr>
+        <w:t>Research Projects</w:t>
       </w:r>
     </w:p>
     <w:p>
@@ -1738,7 +1788,7 @@
         <w:tabs>
           <w:tab w:pos="1920" w:val="left"/>
         </w:tabs>
-        <w:spacing w:before="0" w:after="40" w:line="250" w:lineRule="auto"/>
+        <w:spacing w:before="0" w:after="30" w:line="245" w:lineRule="auto"/>
         <w:ind w:left="1920" w:hanging="1920"/>
         <w:jc w:val="left"/>
       </w:pPr>
@@ -1776,7 +1826,7 @@
         <w:tabs>
           <w:tab w:pos="1920" w:val="left"/>
         </w:tabs>
-        <w:spacing w:before="0" w:after="40" w:line="250" w:lineRule="auto"/>
+        <w:spacing w:before="0" w:after="30" w:line="245" w:lineRule="auto"/>
         <w:ind w:left="1920" w:hanging="1920"/>
         <w:jc w:val="left"/>
       </w:pPr>
@@ -1814,7 +1864,7 @@
         <w:tabs>
           <w:tab w:pos="1920" w:val="left"/>
         </w:tabs>
-        <w:spacing w:before="0" w:after="40" w:line="250" w:lineRule="auto"/>
+        <w:spacing w:before="0" w:after="30" w:line="245" w:lineRule="auto"/>
         <w:ind w:left="1920" w:hanging="1920"/>
         <w:jc w:val="left"/>
       </w:pPr>
@@ -1852,7 +1902,7 @@
         <w:tabs>
           <w:tab w:pos="1920" w:val="left"/>
         </w:tabs>
-        <w:spacing w:before="0" w:after="40" w:line="250" w:lineRule="auto"/>
+        <w:spacing w:before="0" w:after="30" w:line="245" w:lineRule="auto"/>
         <w:ind w:left="1920" w:hanging="1920"/>
         <w:jc w:val="left"/>
       </w:pPr>
@@ -1890,7 +1940,7 @@
         <w:tabs>
           <w:tab w:pos="1920" w:val="left"/>
         </w:tabs>
-        <w:spacing w:before="0" w:after="40" w:line="250" w:lineRule="auto"/>
+        <w:spacing w:before="0" w:after="30" w:line="245" w:lineRule="auto"/>
         <w:ind w:left="1920" w:hanging="1920"/>
         <w:jc w:val="left"/>
       </w:pPr>
@@ -1928,7 +1978,7 @@
         <w:tabs>
           <w:tab w:pos="1920" w:val="left"/>
         </w:tabs>
-        <w:spacing w:before="0" w:after="40" w:line="250" w:lineRule="auto"/>
+        <w:spacing w:before="0" w:after="30" w:line="245" w:lineRule="auto"/>
         <w:ind w:left="1920" w:hanging="1920"/>
         <w:jc w:val="left"/>
       </w:pPr>
@@ -1966,7 +2016,7 @@
         <w:tabs>
           <w:tab w:pos="1920" w:val="left"/>
         </w:tabs>
-        <w:spacing w:before="0" w:after="40" w:line="250" w:lineRule="auto"/>
+        <w:spacing w:before="0" w:after="30" w:line="245" w:lineRule="auto"/>
         <w:ind w:left="1920" w:hanging="1920"/>
         <w:jc w:val="left"/>
       </w:pPr>
@@ -2004,7 +2054,7 @@
         <w:tabs>
           <w:tab w:pos="1920" w:val="left"/>
         </w:tabs>
-        <w:spacing w:before="0" w:after="40" w:line="250" w:lineRule="auto"/>
+        <w:spacing w:before="0" w:after="30" w:line="245" w:lineRule="auto"/>
         <w:ind w:left="1920" w:hanging="1920"/>
         <w:jc w:val="left"/>
       </w:pPr>
@@ -2042,7 +2092,7 @@
         <w:tabs>
           <w:tab w:pos="1920" w:val="left"/>
         </w:tabs>
-        <w:spacing w:before="0" w:after="40" w:line="250" w:lineRule="auto"/>
+        <w:spacing w:before="0" w:after="30" w:line="245" w:lineRule="auto"/>
         <w:ind w:left="1920" w:hanging="1920"/>
         <w:jc w:val="left"/>
       </w:pPr>
@@ -2080,7 +2130,7 @@
         <w:tabs>
           <w:tab w:pos="1920" w:val="left"/>
         </w:tabs>
-        <w:spacing w:before="0" w:after="40" w:line="250" w:lineRule="auto"/>
+        <w:spacing w:before="0" w:after="30" w:line="245" w:lineRule="auto"/>
         <w:ind w:left="1920" w:hanging="1920"/>
         <w:jc w:val="left"/>
       </w:pPr>
@@ -2118,7 +2168,7 @@
         <w:tabs>
           <w:tab w:pos="1920" w:val="left"/>
         </w:tabs>
-        <w:spacing w:before="0" w:after="40" w:line="250" w:lineRule="auto"/>
+        <w:spacing w:before="0" w:after="30" w:line="245" w:lineRule="auto"/>
         <w:ind w:left="1920" w:hanging="1920"/>
         <w:jc w:val="left"/>
       </w:pPr>
@@ -2156,7 +2206,7 @@
         <w:tabs>
           <w:tab w:pos="1920" w:val="left"/>
         </w:tabs>
-        <w:spacing w:before="0" w:after="40" w:line="250" w:lineRule="auto"/>
+        <w:spacing w:before="0" w:after="30" w:line="245" w:lineRule="auto"/>
         <w:ind w:left="1920" w:hanging="1920"/>
         <w:jc w:val="left"/>
       </w:pPr>
@@ -2194,7 +2244,7 @@
         <w:tabs>
           <w:tab w:pos="1920" w:val="left"/>
         </w:tabs>
-        <w:spacing w:before="0" w:after="40" w:line="250" w:lineRule="auto"/>
+        <w:spacing w:before="0" w:after="30" w:line="245" w:lineRule="auto"/>
         <w:ind w:left="1920" w:hanging="1920"/>
         <w:jc w:val="left"/>
       </w:pPr>
@@ -2232,7 +2282,7 @@
         <w:tabs>
           <w:tab w:pos="1920" w:val="left"/>
         </w:tabs>
-        <w:spacing w:before="0" w:after="40" w:line="250" w:lineRule="auto"/>
+        <w:spacing w:before="0" w:after="30" w:line="245" w:lineRule="auto"/>
         <w:ind w:left="1920" w:hanging="1920"/>
         <w:jc w:val="left"/>
       </w:pPr>
@@ -2270,7 +2320,7 @@
         <w:tabs>
           <w:tab w:pos="1920" w:val="left"/>
         </w:tabs>
-        <w:spacing w:before="0" w:after="40" w:line="250" w:lineRule="auto"/>
+        <w:spacing w:before="0" w:after="30" w:line="245" w:lineRule="auto"/>
         <w:ind w:left="1920" w:hanging="1920"/>
         <w:jc w:val="left"/>
       </w:pPr>
@@ -2308,7 +2358,7 @@
         <w:tabs>
           <w:tab w:pos="1920" w:val="left"/>
         </w:tabs>
-        <w:spacing w:before="0" w:after="40" w:line="250" w:lineRule="auto"/>
+        <w:spacing w:before="0" w:after="30" w:line="245" w:lineRule="auto"/>
         <w:ind w:left="1920" w:hanging="1920"/>
         <w:jc w:val="left"/>
       </w:pPr>
@@ -2346,7 +2396,7 @@
         <w:tabs>
           <w:tab w:pos="1920" w:val="left"/>
         </w:tabs>
-        <w:spacing w:before="0" w:after="40" w:line="250" w:lineRule="auto"/>
+        <w:spacing w:before="0" w:after="30" w:line="245" w:lineRule="auto"/>
         <w:ind w:left="1920" w:hanging="1920"/>
         <w:jc w:val="left"/>
       </w:pPr>
@@ -2384,7 +2434,7 @@
         <w:tabs>
           <w:tab w:pos="1920" w:val="left"/>
         </w:tabs>
-        <w:spacing w:before="0" w:after="40" w:line="250" w:lineRule="auto"/>
+        <w:spacing w:before="0" w:after="30" w:line="245" w:lineRule="auto"/>
         <w:ind w:left="1920" w:hanging="1920"/>
         <w:jc w:val="left"/>
       </w:pPr>
@@ -2422,7 +2472,7 @@
         <w:tabs>
           <w:tab w:pos="1920" w:val="left"/>
         </w:tabs>
-        <w:spacing w:before="0" w:after="40" w:line="250" w:lineRule="auto"/>
+        <w:spacing w:before="0" w:after="30" w:line="245" w:lineRule="auto"/>
         <w:ind w:left="1920" w:hanging="1920"/>
         <w:jc w:val="left"/>
       </w:pPr>
@@ -2457,22 +2507,32 @@
     </w:p>
     <w:p>
       <w:pPr>
-        <w:spacing w:before="180" w:after="60" w:line="250" w:lineRule="auto"/>
+        <w:keepNext/>
+        <w:spacing w:before="120" w:after="60" w:line="245" w:lineRule="auto"/>
         <w:jc w:val="left"/>
       </w:pPr>
       <w:r>
         <w:rPr>
-          <w:rFonts w:eastAsia="맑은 고딕"/>
+          <w:rFonts w:eastAsia="맑은 고딕" w:hint="eastAsia"/>
           <w:b/>
           <w:i w:val="0"/>
           <w:sz w:val="22"/>
         </w:rPr>
-        <w:t>■ International Conference</w:t>
+        <w:t xml:space="preserve">■ </w:t>
+      </w:r>
+      <w:r>
+        <w:rPr>
+          <w:rFonts w:eastAsia="맑은 고딕"/>
+          <w:b/>
+          <w:i w:val="0"/>
+          <w:sz w:val="22"/>
+        </w:rPr>
+        <w:t>International Conference</w:t>
       </w:r>
     </w:p>
     <w:p>
       <w:pPr>
-        <w:spacing w:before="0" w:after="40" w:line="250" w:lineRule="auto"/>
+        <w:spacing w:before="0" w:after="24" w:line="245" w:lineRule="auto"/>
         <w:ind w:left="360" w:hanging="360"/>
         <w:jc w:val="left"/>
       </w:pPr>
@@ -2515,7 +2575,7 @@
     </w:p>
     <w:p>
       <w:pPr>
-        <w:spacing w:before="0" w:after="40" w:line="250" w:lineRule="auto"/>
+        <w:spacing w:before="0" w:after="24" w:line="245" w:lineRule="auto"/>
         <w:ind w:left="360" w:hanging="360"/>
         <w:jc w:val="left"/>
       </w:pPr>
@@ -2558,7 +2618,7 @@
     </w:p>
     <w:p>
       <w:pPr>
-        <w:spacing w:before="0" w:after="40" w:line="250" w:lineRule="auto"/>
+        <w:spacing w:before="0" w:after="24" w:line="245" w:lineRule="auto"/>
         <w:ind w:left="360" w:hanging="360"/>
         <w:jc w:val="left"/>
       </w:pPr>
@@ -2601,7 +2661,7 @@
     </w:p>
     <w:p>
       <w:pPr>
-        <w:spacing w:before="0" w:after="40" w:line="250" w:lineRule="auto"/>
+        <w:spacing w:before="0" w:after="24" w:line="245" w:lineRule="auto"/>
         <w:ind w:left="360" w:hanging="360"/>
         <w:jc w:val="left"/>
       </w:pPr>
@@ -2644,7 +2704,7 @@
     </w:p>
     <w:p>
       <w:pPr>
-        <w:spacing w:before="0" w:after="40" w:line="250" w:lineRule="auto"/>
+        <w:spacing w:before="0" w:after="24" w:line="245" w:lineRule="auto"/>
         <w:ind w:left="360" w:hanging="360"/>
         <w:jc w:val="left"/>
       </w:pPr>
@@ -2687,7 +2747,7 @@
     </w:p>
     <w:p>
       <w:pPr>
-        <w:spacing w:before="0" w:after="40" w:line="250" w:lineRule="auto"/>
+        <w:spacing w:before="0" w:after="24" w:line="245" w:lineRule="auto"/>
         <w:ind w:left="360" w:hanging="360"/>
         <w:jc w:val="left"/>
       </w:pPr>
@@ -2730,7 +2790,7 @@
     </w:p>
     <w:p>
       <w:pPr>
-        <w:spacing w:before="0" w:after="40" w:line="250" w:lineRule="auto"/>
+        <w:spacing w:before="0" w:after="24" w:line="245" w:lineRule="auto"/>
         <w:ind w:left="360" w:hanging="360"/>
         <w:jc w:val="left"/>
       </w:pPr>
@@ -2773,7 +2833,7 @@
     </w:p>
     <w:p>
       <w:pPr>
-        <w:spacing w:before="0" w:after="40" w:line="250" w:lineRule="auto"/>
+        <w:spacing w:before="0" w:after="24" w:line="245" w:lineRule="auto"/>
         <w:ind w:left="360" w:hanging="360"/>
         <w:jc w:val="left"/>
       </w:pPr>
@@ -2816,22 +2876,32 @@
     </w:p>
     <w:p>
       <w:pPr>
-        <w:spacing w:before="180" w:after="60" w:line="250" w:lineRule="auto"/>
+        <w:keepNext/>
+        <w:spacing w:before="120" w:after="60" w:line="245" w:lineRule="auto"/>
         <w:jc w:val="left"/>
       </w:pPr>
       <w:r>
         <w:rPr>
-          <w:rFonts w:eastAsia="맑은 고딕"/>
+          <w:rFonts w:eastAsia="맑은 고딕" w:hint="eastAsia"/>
           <w:b/>
           <w:i w:val="0"/>
           <w:sz w:val="22"/>
         </w:rPr>
-        <w:t>■ Domestic Conference</w:t>
+        <w:t xml:space="preserve">■ </w:t>
+      </w:r>
+      <w:r>
+        <w:rPr>
+          <w:rFonts w:eastAsia="맑은 고딕"/>
+          <w:b/>
+          <w:i w:val="0"/>
+          <w:sz w:val="22"/>
+        </w:rPr>
+        <w:t>Domestic Conference</w:t>
       </w:r>
     </w:p>
     <w:p>
       <w:pPr>
-        <w:spacing w:before="0" w:after="40" w:line="250" w:lineRule="auto"/>
+        <w:spacing w:before="0" w:after="24" w:line="245" w:lineRule="auto"/>
         <w:ind w:left="360" w:hanging="360"/>
         <w:jc w:val="left"/>
       </w:pPr>
@@ -2874,7 +2944,7 @@
     </w:p>
     <w:p>
       <w:pPr>
-        <w:spacing w:before="0" w:after="40" w:line="250" w:lineRule="auto"/>
+        <w:spacing w:before="0" w:after="24" w:line="245" w:lineRule="auto"/>
         <w:ind w:left="360" w:hanging="360"/>
         <w:jc w:val="left"/>
       </w:pPr>
@@ -2917,7 +2987,7 @@
     </w:p>
     <w:p>
       <w:pPr>
-        <w:spacing w:before="0" w:after="40" w:line="250" w:lineRule="auto"/>
+        <w:spacing w:before="0" w:after="24" w:line="245" w:lineRule="auto"/>
         <w:ind w:left="360" w:hanging="360"/>
         <w:jc w:val="left"/>
       </w:pPr>
@@ -2960,7 +3030,7 @@
     </w:p>
     <w:p>
       <w:pPr>
-        <w:spacing w:before="0" w:after="40" w:line="250" w:lineRule="auto"/>
+        <w:spacing w:before="0" w:after="24" w:line="245" w:lineRule="auto"/>
         <w:ind w:left="360" w:hanging="360"/>
         <w:jc w:val="left"/>
       </w:pPr>
@@ -3003,22 +3073,32 @@
     </w:p>
     <w:p>
       <w:pPr>
-        <w:spacing w:before="180" w:after="60" w:line="250" w:lineRule="auto"/>
+        <w:keepNext/>
+        <w:spacing w:before="120" w:after="60" w:line="245" w:lineRule="auto"/>
         <w:jc w:val="left"/>
       </w:pPr>
       <w:r>
         <w:rPr>
-          <w:rFonts w:eastAsia="맑은 고딕"/>
+          <w:rFonts w:eastAsia="맑은 고딕" w:hint="eastAsia"/>
           <w:b/>
           <w:i w:val="0"/>
           <w:sz w:val="22"/>
         </w:rPr>
-        <w:t>■ Patents</w:t>
+        <w:t xml:space="preserve">■ </w:t>
+      </w:r>
+      <w:r>
+        <w:rPr>
+          <w:rFonts w:eastAsia="맑은 고딕"/>
+          <w:b/>
+          <w:i w:val="0"/>
+          <w:sz w:val="22"/>
+        </w:rPr>
+        <w:t>Patents</w:t>
       </w:r>
     </w:p>
     <w:p>
       <w:pPr>
-        <w:spacing w:before="0" w:after="40" w:line="250" w:lineRule="auto"/>
+        <w:spacing w:before="0" w:after="24" w:line="245" w:lineRule="auto"/>
         <w:ind w:left="360" w:hanging="360"/>
         <w:jc w:val="left"/>
       </w:pPr>
@@ -3052,7 +3132,7 @@
     </w:p>
     <w:p>
       <w:pPr>
-        <w:spacing w:before="0" w:after="40" w:line="250" w:lineRule="auto"/>
+        <w:spacing w:before="0" w:after="24" w:line="245" w:lineRule="auto"/>
         <w:ind w:left="360" w:hanging="360"/>
         <w:jc w:val="left"/>
       </w:pPr>
@@ -3086,7 +3166,7 @@
     </w:p>
     <w:p>
       <w:pPr>
-        <w:spacing w:before="0" w:after="40" w:line="250" w:lineRule="auto"/>
+        <w:spacing w:before="0" w:after="24" w:line="245" w:lineRule="auto"/>
         <w:ind w:left="360" w:hanging="360"/>
         <w:jc w:val="left"/>
       </w:pPr>
@@ -3120,7 +3200,7 @@
     </w:p>
     <w:p>
       <w:pPr>
-        <w:spacing w:before="0" w:after="40" w:line="250" w:lineRule="auto"/>
+        <w:spacing w:before="0" w:after="24" w:line="245" w:lineRule="auto"/>
         <w:ind w:left="360" w:hanging="360"/>
         <w:jc w:val="left"/>
       </w:pPr>
@@ -3154,7 +3234,7 @@
     </w:p>
     <w:p>
       <w:pPr>
-        <w:spacing w:before="0" w:after="40" w:line="250" w:lineRule="auto"/>
+        <w:spacing w:before="0" w:after="24" w:line="245" w:lineRule="auto"/>
         <w:ind w:left="360" w:hanging="360"/>
         <w:jc w:val="left"/>
       </w:pPr>
@@ -3188,22 +3268,32 @@
     </w:p>
     <w:p>
       <w:pPr>
-        <w:spacing w:before="180" w:after="60" w:line="250" w:lineRule="auto"/>
+        <w:keepNext/>
+        <w:spacing w:before="120" w:after="60" w:line="245" w:lineRule="auto"/>
         <w:jc w:val="left"/>
       </w:pPr>
       <w:r>
         <w:rPr>
-          <w:rFonts w:eastAsia="맑은 고딕"/>
+          <w:rFonts w:eastAsia="맑은 고딕" w:hint="eastAsia"/>
           <w:b/>
           <w:i w:val="0"/>
           <w:sz w:val="22"/>
         </w:rPr>
-        <w:t>■ Specializations</w:t>
+        <w:t xml:space="preserve">■ </w:t>
+      </w:r>
+      <w:r>
+        <w:rPr>
+          <w:rFonts w:eastAsia="맑은 고딕"/>
+          <w:b/>
+          <w:i w:val="0"/>
+          <w:sz w:val="22"/>
+        </w:rPr>
+        <w:t>Specializations</w:t>
       </w:r>
     </w:p>
     <w:p>
       <w:pPr>
-        <w:spacing w:before="0" w:after="40" w:line="250" w:lineRule="auto"/>
+        <w:spacing w:before="0" w:after="24" w:line="245" w:lineRule="auto"/>
         <w:ind w:left="360"/>
         <w:jc w:val="left"/>
       </w:pPr>
@@ -3228,7 +3318,7 @@
     </w:p>
     <w:p>
       <w:pPr>
-        <w:spacing w:before="0" w:after="40" w:line="250" w:lineRule="auto"/>
+        <w:spacing w:before="0" w:after="24" w:line="245" w:lineRule="auto"/>
         <w:ind w:left="360"/>
         <w:jc w:val="left"/>
       </w:pPr>
@@ -3253,7 +3343,7 @@
     </w:p>
     <w:p>
       <w:pPr>
-        <w:spacing w:before="0" w:after="40" w:line="250" w:lineRule="auto"/>
+        <w:spacing w:before="0" w:after="24" w:line="245" w:lineRule="auto"/>
         <w:ind w:left="360"/>
         <w:jc w:val="left"/>
       </w:pPr>
@@ -3278,7 +3368,7 @@
     </w:p>
     <w:p>
       <w:pPr>
-        <w:spacing w:before="0" w:after="40" w:line="250" w:lineRule="auto"/>
+        <w:spacing w:before="0" w:after="24" w:line="245" w:lineRule="auto"/>
         <w:ind w:left="360"/>
         <w:jc w:val="left"/>
       </w:pPr>
@@ -3303,7 +3393,7 @@
     </w:p>
     <w:p>
       <w:pPr>
-        <w:spacing w:before="0" w:after="40" w:line="250" w:lineRule="auto"/>
+        <w:spacing w:before="0" w:after="24" w:line="245" w:lineRule="auto"/>
         <w:ind w:left="360"/>
         <w:jc w:val="left"/>
       </w:pPr>
@@ -3328,22 +3418,32 @@
     </w:p>
     <w:p>
       <w:pPr>
-        <w:spacing w:before="180" w:after="60" w:line="250" w:lineRule="auto"/>
+        <w:keepNext/>
+        <w:spacing w:before="120" w:after="60" w:line="245" w:lineRule="auto"/>
         <w:jc w:val="left"/>
       </w:pPr>
       <w:r>
         <w:rPr>
-          <w:rFonts w:eastAsia="맑은 고딕"/>
+          <w:rFonts w:eastAsia="맑은 고딕" w:hint="eastAsia"/>
           <w:b/>
           <w:i w:val="0"/>
           <w:sz w:val="22"/>
         </w:rPr>
-        <w:t>■ Active Collaborations</w:t>
+        <w:t xml:space="preserve">■ </w:t>
+      </w:r>
+      <w:r>
+        <w:rPr>
+          <w:rFonts w:eastAsia="맑은 고딕"/>
+          <w:b/>
+          <w:i w:val="0"/>
+          <w:sz w:val="22"/>
+        </w:rPr>
+        <w:t>Active Collaborations</w:t>
       </w:r>
     </w:p>
     <w:p>
       <w:pPr>
-        <w:spacing w:before="0" w:after="40" w:line="250" w:lineRule="auto"/>
+        <w:spacing w:before="0" w:after="24" w:line="245" w:lineRule="auto"/>
         <w:ind w:left="360" w:hanging="360"/>
         <w:jc w:val="left"/>
       </w:pPr>
@@ -3368,7 +3468,7 @@
     </w:p>
     <w:p>
       <w:pPr>
-        <w:spacing w:before="0" w:after="40" w:line="250" w:lineRule="auto"/>
+        <w:spacing w:before="0" w:after="24" w:line="245" w:lineRule="auto"/>
         <w:ind w:left="360" w:hanging="360"/>
         <w:jc w:val="left"/>
       </w:pPr>
@@ -3393,7 +3493,7 @@
     </w:p>
     <w:p>
       <w:pPr>
-        <w:spacing w:before="0" w:after="40" w:line="250" w:lineRule="auto"/>
+        <w:spacing w:before="0" w:after="24" w:line="245" w:lineRule="auto"/>
         <w:ind w:left="360" w:hanging="360"/>
         <w:jc w:val="left"/>
       </w:pPr>
@@ -3418,7 +3518,7 @@
     </w:p>
     <w:p>
       <w:pPr>
-        <w:spacing w:before="0" w:after="40" w:line="250" w:lineRule="auto"/>
+        <w:spacing w:before="0" w:after="24" w:line="245" w:lineRule="auto"/>
         <w:ind w:left="360" w:hanging="360"/>
         <w:jc w:val="left"/>
       </w:pPr>
@@ -3443,22 +3543,32 @@
     </w:p>
     <w:p>
       <w:pPr>
-        <w:spacing w:before="180" w:after="60" w:line="250" w:lineRule="auto"/>
+        <w:keepNext/>
+        <w:spacing w:before="120" w:after="60" w:line="245" w:lineRule="auto"/>
         <w:jc w:val="left"/>
       </w:pPr>
       <w:r>
         <w:rPr>
-          <w:rFonts w:eastAsia="맑은 고딕"/>
+          <w:rFonts w:eastAsia="맑은 고딕" w:hint="eastAsia"/>
           <w:b/>
           <w:i w:val="0"/>
           <w:sz w:val="22"/>
         </w:rPr>
-        <w:t>■ Research Interests</w:t>
+        <w:t xml:space="preserve">■ </w:t>
+      </w:r>
+      <w:r>
+        <w:rPr>
+          <w:rFonts w:eastAsia="맑은 고딕"/>
+          <w:b/>
+          <w:i w:val="0"/>
+          <w:sz w:val="22"/>
+        </w:rPr>
+        <w:t>Research Interests</w:t>
       </w:r>
     </w:p>
     <w:p>
       <w:pPr>
-        <w:spacing w:before="0" w:after="40" w:line="250" w:lineRule="auto"/>
+        <w:spacing w:before="0" w:after="40" w:line="245" w:lineRule="auto"/>
         <w:ind w:left="360"/>
         <w:jc w:val="left"/>
       </w:pPr>
@@ -3474,22 +3584,32 @@
     </w:p>
     <w:p>
       <w:pPr>
-        <w:spacing w:before="180" w:after="60" w:line="250" w:lineRule="auto"/>
+        <w:keepNext/>
+        <w:spacing w:before="120" w:after="60" w:line="245" w:lineRule="auto"/>
         <w:jc w:val="left"/>
       </w:pPr>
       <w:r>
         <w:rPr>
-          <w:rFonts w:eastAsia="맑은 고딕"/>
+          <w:rFonts w:eastAsia="맑은 고딕" w:hint="eastAsia"/>
           <w:b/>
           <w:i w:val="0"/>
           <w:sz w:val="22"/>
         </w:rPr>
-        <w:t>■ Google Scholar Metrics</w:t>
+        <w:t xml:space="preserve">■ </w:t>
+      </w:r>
+      <w:r>
+        <w:rPr>
+          <w:rFonts w:eastAsia="맑은 고딕"/>
+          <w:b/>
+          <w:i w:val="0"/>
+          <w:sz w:val="22"/>
+        </w:rPr>
+        <w:t>Google Scholar Metrics</w:t>
       </w:r>
     </w:p>
     <w:p>
       <w:pPr>
-        <w:spacing w:before="0" w:after="40" w:line="250" w:lineRule="auto"/>
+        <w:spacing w:before="0" w:after="24" w:line="245" w:lineRule="auto"/>
         <w:ind w:left="360"/>
         <w:jc w:val="left"/>
       </w:pPr>
@@ -3559,7 +3679,7 @@
     </w:p>
     <w:sectPr>
       <w:pgSz w:w="12240" w:h="15840"/>
-      <w:pgMar w:top="960" w:right="1000" w:bottom="960" w:left="1000" w:header="720" w:footer="720" w:gutter="0"/>
+      <w:pgMar w:top="800" w:right="1000" w:bottom="800" w:left="1000" w:header="720" w:footer="720" w:gutter="0"/>
       <w:cols w:space="720"/>
       <w:docGrid w:linePitch="360"/>
     </w:sectPr>

</xml_diff>